<commit_message>
fix(docs+OPS-14): re-review residuals: arm count nineteen, CHANGELOG rewrap, AGENTS echo, overview cue order (R1 to R4)
Co-Authored-By: Claude Fable 5 <noreply@anthropic.com>
Claude-Session: https://claude.ai/code/fb5a7ea0-60a8-4586-ba38-df1dfb4b16be
</commit_message>
<xml_diff>
--- a/artifacts/OPS-14/build/program-knowledge-corpus-overview.docx
+++ b/artifacts/OPS-14/build/program-knowledge-corpus-overview.docx
@@ -231,6 +231,18 @@
         </w:numPr>
       </w:pPr>
       <w:r>
+        <w:t xml:space="preserve">The readiness field is set by hand at the end of a checklist, so it is only as good as whichever checklist was used [KB-01, 00:05:28]</w:t>
+      </w:r>
+    </w:p>
+    <w:p>
+      <w:pPr>
+        <w:pStyle w:val="Compact"/>
+        <w:numPr>
+          <w:ilvl w:val="0"/>
+          <w:numId w:val="1004"/>
+        </w:numPr>
+      </w:pPr>
+      <w:r>
         <w:t xml:space="preserve">Some regions were flagged ready before the readiness checklist existed [KB-01, 00:06:08]</w:t>
       </w:r>
     </w:p>
@@ -268,18 +280,6 @@
       </w:pPr>
       <w:r>
         <w:t xml:space="preserve">There was no written path for who hears about a customer stuck partway through onboarding [KB-01, 00:37:31]</w:t>
-      </w:r>
-    </w:p>
-    <w:p>
-      <w:pPr>
-        <w:pStyle w:val="Compact"/>
-        <w:numPr>
-          <w:ilvl w:val="0"/>
-          <w:numId w:val="1004"/>
-        </w:numPr>
-      </w:pPr>
-      <w:r>
-        <w:t xml:space="preserve">The readiness field is set by hand at the end of a checklist, so it is only as good as whichever checklist was used [KB-01, 00:05:28]</w:t>
       </w:r>
     </w:p>
     <w:p>

</xml_diff>